<commit_message>
commit fine lezione 22 maggio
</commit_message>
<xml_diff>
--- a/3-Allegati/Diario/AntonioMolteni/Diario8Maggio.docx
+++ b/3-Allegati/Diario/AntonioMolteni/Diario8Maggio.docx
@@ -316,6 +316,12 @@
                 <w:rFonts w:ascii="Arial" w:hAnsi="Arial" w:cs="Arial"/>
               </w:rPr>
             </w:pPr>
+            <w:r>
+              <w:rPr>
+                <w:rFonts w:ascii="Arial" w:hAnsi="Arial" w:cs="Arial"/>
+              </w:rPr>
+              <w:t>Creazione del CreateTaskPage XAML e CS</w:t>
+            </w:r>
           </w:p>
         </w:tc>
       </w:tr>
@@ -2025,6 +2031,7 @@
   <w:style w:type="character" w:default="1" w:styleId="Carpredefinitoparagrafo">
     <w:name w:val="Default Paragraph Font"/>
     <w:uiPriority w:val="1"/>
+    <w:semiHidden/>
     <w:unhideWhenUsed/>
   </w:style>
   <w:style w:type="table" w:default="1" w:styleId="Tabellanormale">
@@ -2725,6 +2732,7 @@
     <w:rsid w:val="004503B3"/>
     <w:rsid w:val="00455370"/>
     <w:rsid w:val="00463B7E"/>
+    <w:rsid w:val="00476E5E"/>
     <w:rsid w:val="00477AA9"/>
     <w:rsid w:val="0048777E"/>
     <w:rsid w:val="00496797"/>
@@ -2806,6 +2814,7 @@
     <w:rsid w:val="00AE32CB"/>
     <w:rsid w:val="00AE405E"/>
     <w:rsid w:val="00B016E5"/>
+    <w:rsid w:val="00B01BD7"/>
     <w:rsid w:val="00B01CBF"/>
     <w:rsid w:val="00B13199"/>
     <w:rsid w:val="00B255ED"/>

</xml_diff>